<commit_message>
chore(sync): sync all download assets with overhauled legal dossiers
</commit_message>
<xml_diff>
--- a/downloads/富宇大境區分所有權人獨立分割正式提案申請書暨全體連署同意書.docx
+++ b/downloads/富宇大境區分所有權人獨立分割正式提案申請書暨全體連署同意書.docx
@@ -12,25 +12,25 @@
           <w:rFonts w:ascii="PingFang TC" w:hAnsi="PingFang TC"/>
           <w:b/>
           <w:color w:val="B8860B"/>
-          <w:sz w:val="30"/>
+          <w:sz w:val="27"/>
         </w:rPr>
         <w:t>富宇大境（A2 區）區分所有權人獨立分割正式提案申請書</w:t>
         <w:br/>
-        <w:t>暨全體區權人連署同意書</w:t>
+        <w:t>暨全體區權人連署立案冊</w:t>
       </w:r>
     </w:p>
     <w:p>
       <w:pPr>
-        <w:spacing w:before="0" w:after="120"/>
+        <w:spacing w:before="0" w:after="80"/>
         <w:jc w:val="center"/>
       </w:pPr>
       <w:r>
         <w:rPr>
           <w:rFonts w:ascii="PingFang TC" w:hAnsi="PingFang TC"/>
           <w:color w:val="8C8273"/>
-          <w:sz w:val="17"/>
+          <w:sz w:val="16"/>
         </w:rPr>
-        <w:t>依據《公寓大廈管理條例》第 26 條第 1 項規定辦理</w:t>
+        <w:t>依據《公寓大廈管理條例》第 53 條、第 31 條及《管理組織申請報備處理原則》提請審議</w:t>
       </w:r>
     </w:p>
     <w:tbl>
@@ -46,13 +46,13 @@
       <w:tr>
         <w:tc>
           <w:tcPr>
-            <w:tcW w:type="dxa" w:w="1587"/>
+            <w:tcW w:type="dxa" w:w="1474"/>
             <w:shd w:fill="FFFDF5"/>
             <w:tcMar>
-              <w:top w:w="45" w:type="dxa"/>
-              <w:bottom w:w="45" w:type="dxa"/>
-              <w:left w:w="80" w:type="dxa"/>
-              <w:right w:w="80" w:type="dxa"/>
+              <w:top w:w="35" w:type="dxa"/>
+              <w:bottom w:w="35" w:type="dxa"/>
+              <w:left w:w="60" w:type="dxa"/>
+              <w:right w:w="60" w:type="dxa"/>
             </w:tcMar>
           </w:tcPr>
           <w:p>
@@ -64,7 +64,7 @@
                 <w:rFonts w:ascii="PingFang TC" w:hAnsi="PingFang TC"/>
                 <w:b/>
                 <w:color w:val="B8860B"/>
-                <w:sz w:val="17"/>
+                <w:sz w:val="16"/>
               </w:rPr>
               <w:t>受 文 者</w:t>
             </w:r>
@@ -72,13 +72,13 @@
         </w:tc>
         <w:tc>
           <w:tcPr>
-            <w:tcW w:type="dxa" w:w="8277"/>
+            <w:tcW w:type="dxa" w:w="8391"/>
             <w:shd w:fill="FFFFFF"/>
             <w:tcMar>
-              <w:top w:w="45" w:type="dxa"/>
-              <w:bottom w:w="45" w:type="dxa"/>
-              <w:left w:w="80" w:type="dxa"/>
-              <w:right w:w="80" w:type="dxa"/>
+              <w:top w:w="35" w:type="dxa"/>
+              <w:bottom w:w="35" w:type="dxa"/>
+              <w:left w:w="60" w:type="dxa"/>
+              <w:right w:w="60" w:type="dxa"/>
             </w:tcMar>
           </w:tcPr>
           <w:p>
@@ -89,9 +89,9 @@
               <w:rPr>
                 <w:rFonts w:ascii="PingFang TC" w:hAnsi="PingFang TC"/>
                 <w:color w:val="1A1D20"/>
-                <w:sz w:val="17"/>
+                <w:sz w:val="16"/>
               </w:rPr>
-              <w:t>富宇大地社區管理委員會（主任委員 馬士傑 先生）  副本抄送：台中市龍井區公所、台中市政府住宅處</w:t>
+              <w:t>富宇大地社區管理委員會（主任委員暨全體管理委員）  副本：主管機關區公所、臺中市政府都市發展局</w:t>
             </w:r>
           </w:p>
         </w:tc>
@@ -99,13 +99,13 @@
       <w:tr>
         <w:tc>
           <w:tcPr>
-            <w:tcW w:type="dxa" w:w="1587"/>
+            <w:tcW w:type="dxa" w:w="1474"/>
             <w:shd w:fill="FFFDF5"/>
             <w:tcMar>
-              <w:top w:w="45" w:type="dxa"/>
-              <w:bottom w:w="45" w:type="dxa"/>
-              <w:left w:w="80" w:type="dxa"/>
-              <w:right w:w="80" w:type="dxa"/>
+              <w:top w:w="35" w:type="dxa"/>
+              <w:bottom w:w="35" w:type="dxa"/>
+              <w:left w:w="60" w:type="dxa"/>
+              <w:right w:w="60" w:type="dxa"/>
             </w:tcMar>
           </w:tcPr>
           <w:p>
@@ -117,7 +117,7 @@
                 <w:rFonts w:ascii="PingFang TC" w:hAnsi="PingFang TC"/>
                 <w:b/>
                 <w:color w:val="B8860B"/>
-                <w:sz w:val="17"/>
+                <w:sz w:val="16"/>
               </w:rPr>
               <w:t>發文提案人</w:t>
             </w:r>
@@ -125,13 +125,13 @@
         </w:tc>
         <w:tc>
           <w:tcPr>
-            <w:tcW w:type="dxa" w:w="8277"/>
+            <w:tcW w:type="dxa" w:w="8391"/>
             <w:shd w:fill="FAF8F2"/>
             <w:tcMar>
-              <w:top w:w="45" w:type="dxa"/>
-              <w:bottom w:w="45" w:type="dxa"/>
-              <w:left w:w="80" w:type="dxa"/>
-              <w:right w:w="80" w:type="dxa"/>
+              <w:top w:w="35" w:type="dxa"/>
+              <w:bottom w:w="35" w:type="dxa"/>
+              <w:left w:w="60" w:type="dxa"/>
+              <w:right w:w="60" w:type="dxa"/>
             </w:tcMar>
           </w:tcPr>
           <w:p>
@@ -142,9 +142,9 @@
               <w:rPr>
                 <w:rFonts w:ascii="PingFang TC" w:hAnsi="PingFang TC"/>
                 <w:color w:val="1A1D20"/>
-                <w:sz w:val="17"/>
+                <w:sz w:val="16"/>
               </w:rPr>
-              <w:t>富宇大境（A2 區）全體 6 戶區分所有權人（連署簽章冊如第二頁）</w:t>
+              <w:t>富宇大境（A2 區）全體 6 戶區分所有權人（連署簽章立案名冊如第二頁）</w:t>
             </w:r>
           </w:p>
         </w:tc>
@@ -152,13 +152,13 @@
       <w:tr>
         <w:tc>
           <w:tcPr>
-            <w:tcW w:type="dxa" w:w="1587"/>
+            <w:tcW w:type="dxa" w:w="1474"/>
             <w:shd w:fill="FFFDF5"/>
             <w:tcMar>
-              <w:top w:w="45" w:type="dxa"/>
-              <w:bottom w:w="45" w:type="dxa"/>
-              <w:left w:w="80" w:type="dxa"/>
-              <w:right w:w="80" w:type="dxa"/>
+              <w:top w:w="35" w:type="dxa"/>
+              <w:bottom w:w="35" w:type="dxa"/>
+              <w:left w:w="60" w:type="dxa"/>
+              <w:right w:w="60" w:type="dxa"/>
             </w:tcMar>
           </w:tcPr>
           <w:p>
@@ -170,7 +170,7 @@
                 <w:rFonts w:ascii="PingFang TC" w:hAnsi="PingFang TC"/>
                 <w:b/>
                 <w:color w:val="B8860B"/>
-                <w:sz w:val="17"/>
+                <w:sz w:val="16"/>
               </w:rPr>
               <w:t>法 令 依 據</w:t>
             </w:r>
@@ -178,13 +178,13 @@
         </w:tc>
         <w:tc>
           <w:tcPr>
-            <w:tcW w:type="dxa" w:w="8277"/>
+            <w:tcW w:type="dxa" w:w="8391"/>
             <w:shd w:fill="FFFFFF"/>
             <w:tcMar>
-              <w:top w:w="45" w:type="dxa"/>
-              <w:bottom w:w="45" w:type="dxa"/>
-              <w:left w:w="80" w:type="dxa"/>
-              <w:right w:w="80" w:type="dxa"/>
+              <w:top w:w="35" w:type="dxa"/>
+              <w:bottom w:w="35" w:type="dxa"/>
+              <w:left w:w="60" w:type="dxa"/>
+              <w:right w:w="60" w:type="dxa"/>
             </w:tcMar>
           </w:tcPr>
           <w:p>
@@ -195,9 +195,9 @@
               <w:rPr>
                 <w:rFonts w:ascii="PingFang TC" w:hAnsi="PingFang TC"/>
                 <w:color w:val="1A1D20"/>
-                <w:sz w:val="17"/>
+                <w:sz w:val="16"/>
               </w:rPr>
-              <w:t>《公寓大廈管理條例》第 26 條第 1 項（得各自獨立使用分別成立管理委員會）</w:t>
+              <w:t>《公寓大廈管理條例》第 53 條（集居地區分流準用）、第 31 條（規約管理範圍變更特別決議）</w:t>
             </w:r>
           </w:p>
         </w:tc>
@@ -205,13 +205,13 @@
       <w:tr>
         <w:tc>
           <w:tcPr>
-            <w:tcW w:type="dxa" w:w="1587"/>
+            <w:tcW w:type="dxa" w:w="1474"/>
             <w:shd w:fill="FFFDF5"/>
             <w:tcMar>
-              <w:top w:w="45" w:type="dxa"/>
-              <w:bottom w:w="45" w:type="dxa"/>
-              <w:left w:w="80" w:type="dxa"/>
-              <w:right w:w="80" w:type="dxa"/>
+              <w:top w:w="35" w:type="dxa"/>
+              <w:bottom w:w="35" w:type="dxa"/>
+              <w:left w:w="60" w:type="dxa"/>
+              <w:right w:w="60" w:type="dxa"/>
             </w:tcMar>
           </w:tcPr>
           <w:p>
@@ -223,7 +223,7 @@
                 <w:rFonts w:ascii="PingFang TC" w:hAnsi="PingFang TC"/>
                 <w:b/>
                 <w:color w:val="B8860B"/>
-                <w:sz w:val="17"/>
+                <w:sz w:val="16"/>
               </w:rPr>
               <w:t>受託召集人</w:t>
             </w:r>
@@ -231,13 +231,13 @@
         </w:tc>
         <w:tc>
           <w:tcPr>
-            <w:tcW w:type="dxa" w:w="8277"/>
+            <w:tcW w:type="dxa" w:w="8391"/>
             <w:shd w:fill="FAF8F2"/>
             <w:tcMar>
-              <w:top w:w="45" w:type="dxa"/>
-              <w:bottom w:w="45" w:type="dxa"/>
-              <w:left w:w="80" w:type="dxa"/>
-              <w:right w:w="80" w:type="dxa"/>
+              <w:top w:w="35" w:type="dxa"/>
+              <w:bottom w:w="35" w:type="dxa"/>
+              <w:left w:w="60" w:type="dxa"/>
+              <w:right w:w="60" w:type="dxa"/>
             </w:tcMar>
           </w:tcPr>
           <w:p>
@@ -249,9 +249,9 @@
                 <w:rFonts w:ascii="PingFang TC" w:hAnsi="PingFang TC"/>
                 <w:b/>
                 <w:color w:val="1A1D20"/>
-                <w:sz w:val="17"/>
+                <w:sz w:val="16"/>
               </w:rPr>
-              <w:t>廖倫豪 先生（全權代表本區 6 戶對外接洽、協商與簽收公文）</w:t>
+              <w:t>廖倫豪（全權代表本區 6 戶對外接洽、提請管委會列入例會議程與協助大會議案）</w:t>
             </w:r>
           </w:p>
         </w:tc>
@@ -259,7 +259,7 @@
     </w:tbl>
     <w:p>
       <w:pPr>
-        <w:spacing w:before="40" w:after="40"/>
+        <w:spacing w:before="20" w:after="20"/>
       </w:pPr>
     </w:p>
     <w:tbl>
@@ -277,10 +277,10 @@
             <w:tcW w:type="dxa" w:w="9865"/>
             <w:shd w:fill="FFFDF5"/>
             <w:tcMar>
-              <w:top w:w="70" w:type="dxa"/>
-              <w:bottom w:w="70" w:type="dxa"/>
-              <w:left w:w="120" w:type="dxa"/>
-              <w:right w:w="100" w:type="dxa"/>
+              <w:top w:w="50" w:type="dxa"/>
+              <w:bottom w:w="50" w:type="dxa"/>
+              <w:left w:w="90" w:type="dxa"/>
+              <w:right w:w="70" w:type="dxa"/>
             </w:tcMar>
             <w:tcBorders>
               <w:left w:val="single" w:sz="24" w:space="0" w:color="D4AF37"/>
@@ -291,14 +291,14 @@
           </w:tcPr>
           <w:p>
             <w:pPr>
-              <w:spacing w:line="288" w:lineRule="auto" w:after="0"/>
+              <w:spacing w:line="276" w:lineRule="auto" w:after="0"/>
             </w:pPr>
             <w:r>
               <w:rPr>
                 <w:rFonts w:ascii="PingFang TC" w:hAnsi="PingFang TC"/>
                 <w:b/>
                 <w:color w:val="B8860B"/>
-                <w:sz w:val="19"/>
+                <w:sz w:val="18"/>
               </w:rPr>
               <w:t>【主旨】</w:t>
             </w:r>
@@ -306,9 +306,9 @@
               <w:rPr>
                 <w:rFonts w:ascii="PingFang TC" w:hAnsi="PingFang TC"/>
                 <w:color w:val="1A1D20"/>
-                <w:sz w:val="17"/>
+                <w:sz w:val="16"/>
               </w:rPr>
-              <w:t>為落實權責相符與居住自治原則，富宇大境（A2 區）全體 6 戶區分所有權人謹依《公寓大廈管理條例》第 26 條第 1 項規定，正式提請審議本區「依法自富宇大地社區管理委員會獨立分割、成立富宇大境管理委員會及辦理專案資產移交清算案」，並請列入管理委員會例行會議審議與辦理專案資產移交清算，請 查照。</w:t>
+              <w:t>為落實權責相符、促進管理分流與維護整體社區永續營運，富宇大境（A2 區）全體 6 戶區分所有權人謹依《公寓大廈管理條例》第 53 條、第 31 條規定，正式提請管理委員會列入例行會議審議，並依法排入即將召開之區分所有權人會議，審議「富宇大境自富宇大地管理範圍合意分割獨立、成立富宇大境管理委員會及辦理專案資產清算移交案」，請 查照惠復。</w:t>
             </w:r>
           </w:p>
         </w:tc>
@@ -316,162 +316,162 @@
     </w:tbl>
     <w:p>
       <w:pPr>
-        <w:spacing w:before="80" w:after="40"/>
+        <w:spacing w:before="60" w:after="20"/>
       </w:pPr>
       <w:r>
         <w:rPr>
           <w:rFonts w:ascii="PingFang TC" w:hAnsi="PingFang TC"/>
           <w:b/>
           <w:color w:val="B8860B"/>
-          <w:sz w:val="19"/>
+          <w:sz w:val="18"/>
         </w:rPr>
         <w:t>【說明】</w:t>
       </w:r>
     </w:p>
     <w:p>
       <w:pPr>
-        <w:spacing w:line="276" w:lineRule="auto" w:before="20" w:after="40"/>
+        <w:spacing w:line="269" w:lineRule="auto" w:before="20" w:after="20"/>
       </w:pPr>
       <w:r>
         <w:rPr>
           <w:rFonts w:ascii="PingFang TC" w:hAnsi="PingFang TC"/>
           <w:b/>
           <w:color w:val="B8860B"/>
-          <w:sz w:val="17"/>
+          <w:sz w:val="16"/>
         </w:rPr>
-        <w:t>一、法定獨立要件充分且明確：</w:t>
+        <w:t>一、出入地緣與生活機能完全實質獨立：</w:t>
       </w:r>
       <w:r>
         <w:rPr>
           <w:rFonts w:ascii="PingFang TC" w:hAnsi="PingFang TC"/>
           <w:color w:val="1A1D20"/>
-          <w:sz w:val="17"/>
+          <w:sz w:val="16"/>
         </w:rPr>
-        <w:t>按《公寓大廈管理條例》第 26 條第 1 項明定，多數各自獨立使用之建築物，如各該區得獨立使用且能分別成立管理委員會者，得分別成立管理委員會。本區（A2 大境共 6 戶透天別墅，門牌為台中市沙鹿區龍社路 593、595、597、599、601、603 號）之基地臨接公有計畫道路龍社路，出入交通完全獨立，絕不途經富宇大地內部私設巷道（如 642 巷等），符合得各自獨立使用之法定要件。</w:t>
+        <w:t>按《公寓大廈管理條例》第 53 條規範，集居地區之管理準用本條例。查本區（A2 富宇大境共 6 戶透天別墅，門牌為沙鹿區龍社路 593、595、597、599、601、603 號）基地位處最外緣，直接面臨公有計畫道路龍社路，出入交通直接銜接市區幹道，絕不途經大社區內部私設巷道（如 642 巷等）；出入地緣具備百分之百之獨立性，無通行內部共有道路之需求。</w:t>
       </w:r>
     </w:p>
     <w:p>
       <w:pPr>
-        <w:spacing w:line="276" w:lineRule="auto" w:before="20" w:after="40"/>
+        <w:spacing w:line="269" w:lineRule="auto" w:before="20" w:after="20"/>
       </w:pPr>
       <w:r>
         <w:rPr>
           <w:rFonts w:ascii="PingFang TC" w:hAnsi="PingFang TC"/>
           <w:b/>
           <w:color w:val="B8860B"/>
-          <w:sz w:val="17"/>
+          <w:sz w:val="16"/>
         </w:rPr>
-        <w:t>二、生活機能自理，水電機電排污完全獨立：</w:t>
+        <w:t>二、水電排污設施無依賴，生活垃圾自行清運：</w:t>
       </w:r>
       <w:r>
         <w:rPr>
           <w:rFonts w:ascii="PingFang TC" w:hAnsi="PingFang TC"/>
           <w:color w:val="1A1D20"/>
-          <w:sz w:val="17"/>
+          <w:sz w:val="16"/>
         </w:rPr>
-        <w:t>本區 6 戶透天生活廢棄物，現今均由住戶於門前直接等候台中市環保局公有垃圾車定時清運（完全免費）；本區自願放棄使用內部收費子母車及環保室；且自來水、自用電表與排污系統均由公用幹管直供或獨立自理，完全無接入或依賴富宇大地大社區內部私設之加壓受水池、抽水馬達或排污中繼設備，無任何機電牽絆。</w:t>
+        <w:t>本區 6 戶之自來水進水、自用電表、生活排水與化糞系統均為各自獨立自理或直接接入公共幹管，完全未接入大社區內部加壓水池、中繼泵浦等機電設施；且生活廢棄物均由住戶於門前定時等候市府免費清潔隊清運，本區自願放棄使用大社區內部收費子母車，物理上與生活機能上均不具備不可分之共有依賴。</w:t>
       </w:r>
     </w:p>
     <w:p>
       <w:pPr>
-        <w:spacing w:line="276" w:lineRule="auto" w:before="20" w:after="40"/>
+        <w:spacing w:line="269" w:lineRule="auto" w:before="20" w:after="20"/>
       </w:pPr>
       <w:r>
         <w:rPr>
           <w:rFonts w:ascii="PingFang TC" w:hAnsi="PingFang TC"/>
           <w:b/>
           <w:color w:val="B8860B"/>
-          <w:sz w:val="17"/>
+          <w:sz w:val="16"/>
         </w:rPr>
-        <w:t>三、專款定存單獨立立卷，產權清晰：</w:t>
+        <w:t>三、專款定存單獨立立卷，資產移交界限明確：</w:t>
       </w:r>
       <w:r>
         <w:rPr>
           <w:rFonts w:ascii="PingFang TC" w:hAnsi="PingFang TC"/>
           <w:color w:val="1A1D20"/>
-          <w:sz w:val="17"/>
+          <w:sz w:val="16"/>
         </w:rPr>
-        <w:t>查富宇大地管委會於 115 年 5 月例會決議及 9 月例會財務報告載明，台中市政府核退之公共基金中，「A2 大境區定存單」金額為新台幣 220,231 元整，本屬專款專案保管；連同起造人富宇建設移交之交屋管理基金（每戶 1 萬元，大境 6 戶共 60,000 元整），資產邊界涇渭分明，分割作業完全不影響富宇大地其餘 235 戶原有逾 760 萬元之公共基金與營運大盤。</w:t>
+        <w:t>查管委會 115 年 5 月例會議題四及 9 月財報，新光銀行定存單第 2 筆已白紙黑字獨立開立「A2 大境區定存單 NT$ 220,231 元」專單保管；連同起造人富宇建設移交之交屋管理基金（每戶 1 萬元，大境 6 戶共 60,000 元）。本區建請依審計公平原則，於大會決議通過後全額撥交大境管委會公庫專戶，完全不影響大社區剩餘 235 戶原有逾 760 萬元之運營公共基金，達成雙贏。</w:t>
       </w:r>
     </w:p>
     <w:p>
       <w:pPr>
-        <w:spacing w:before="80" w:after="40"/>
+        <w:spacing w:before="60" w:after="20"/>
       </w:pPr>
       <w:r>
         <w:rPr>
           <w:rFonts w:ascii="PingFang TC" w:hAnsi="PingFang TC"/>
           <w:b/>
           <w:color w:val="B8860B"/>
-          <w:sz w:val="19"/>
+          <w:sz w:val="18"/>
         </w:rPr>
         <w:t>【辦法】</w:t>
       </w:r>
     </w:p>
     <w:p>
       <w:pPr>
-        <w:spacing w:line="276" w:lineRule="auto" w:before="20" w:after="40"/>
+        <w:spacing w:line="269" w:lineRule="auto" w:before="20" w:after="20"/>
       </w:pPr>
       <w:r>
         <w:rPr>
           <w:rFonts w:ascii="PingFang TC" w:hAnsi="PingFang TC"/>
           <w:b/>
           <w:color w:val="D4AF37"/>
-          <w:sz w:val="17"/>
+          <w:sz w:val="16"/>
         </w:rPr>
-        <w:t>一、提案審議作業：</w:t>
+        <w:t>一、例會審議與程序對接：</w:t>
       </w:r>
       <w:r>
         <w:rPr>
           <w:rFonts w:ascii="PingFang TC" w:hAnsi="PingFang TC"/>
           <w:color w:val="1A1D20"/>
-          <w:sz w:val="17"/>
+          <w:sz w:val="16"/>
         </w:rPr>
-        <w:t>請富宇大地社區管理委員會於收受本申請書後，依權責列入最近一次管委會例行會議審議，確認本案法定獨立分割與辦理專案資產清算移交。</w:t>
+        <w:t>建請富宇大地社區管理委員會收受本申請書後，列入最近一次管委會例行會議審議，協助辦理 A2 獨立分割相關法制核對與資產清算前期準備作業。</w:t>
       </w:r>
     </w:p>
     <w:p>
       <w:pPr>
-        <w:spacing w:line="276" w:lineRule="auto" w:before="20" w:after="40"/>
+        <w:spacing w:line="269" w:lineRule="auto" w:before="20" w:after="20"/>
       </w:pPr>
       <w:r>
         <w:rPr>
           <w:rFonts w:ascii="PingFang TC" w:hAnsi="PingFang TC"/>
           <w:b/>
           <w:color w:val="D4AF37"/>
-          <w:sz w:val="17"/>
+          <w:sz w:val="16"/>
         </w:rPr>
-        <w:t>二、資產移交與管理費提存準備：</w:t>
+        <w:t>二、排入區分所有權人會議：</w:t>
       </w:r>
       <w:r>
         <w:rPr>
           <w:rFonts w:ascii="PingFang TC" w:hAnsi="PingFang TC"/>
           <w:color w:val="1A1D20"/>
-          <w:sz w:val="17"/>
+          <w:sz w:val="16"/>
         </w:rPr>
-        <w:t>建請財務委員會先期核算 A2 大境定存單（NT$ 220,231 元加計孳息）與交屋基金（NT$ 60,000 元）之分割協議書草案。自本申請書合法送達之日起至資產清算協議生效之過渡期間，A2 大境 6 戶管理費統一由受託召集人代收提存於大境專戶共管，俟完成清算後依實質公電攤提結算，以杜爭議。</w:t>
+        <w:t>依《公寓大廈管理條例》第 31 條特別決議門檻，建請管委會協助將本分割案及「富宇大地規約第二條管理範圍修正案（排除 A2 棟別）」列入大會正式議案審議，以促成合法合意之雙贏分流。</w:t>
       </w:r>
     </w:p>
     <w:p>
       <w:pPr>
-        <w:spacing w:line="276" w:lineRule="auto" w:before="20" w:after="40"/>
+        <w:spacing w:line="269" w:lineRule="auto" w:before="20" w:after="20"/>
       </w:pPr>
       <w:r>
         <w:rPr>
           <w:rFonts w:ascii="PingFang TC" w:hAnsi="PingFang TC"/>
           <w:b/>
           <w:color w:val="D4AF37"/>
-          <w:sz w:val="17"/>
+          <w:sz w:val="16"/>
         </w:rPr>
-        <w:t>三、報備變更協力：</w:t>
+        <w:t>三、主管機關雙軌報備協力：</w:t>
       </w:r>
       <w:r>
         <w:rPr>
           <w:rFonts w:ascii="PingFang TC" w:hAnsi="PingFang TC"/>
           <w:color w:val="1A1D20"/>
-          <w:sz w:val="17"/>
+          <w:sz w:val="16"/>
         </w:rPr>
-        <w:t>雙方備齊法定申請公文與修訂後規約，共同向主管機關（台中市龍井區公所）辦理報備戶數變更與富宇大境獨立管委會成立備查。</w:t>
+        <w:t>俟大會決議通過後，由雙方管理委員會檢具大會紀錄、修正後規約及分割協議書，共同向主管機關區公所申辦富宇大地戶數變更報備（241 戶變更為 235 戶）及富宇大境獨立管委會備查。</w:t>
       </w:r>
     </w:p>
     <w:p>
@@ -504,7 +504,7 @@
           <w:color w:val="1A1D20"/>
           <w:sz w:val="17"/>
         </w:rPr>
-        <w:t>立連署同意書人確認已審閱上述申請書內容及所附可行性研究報告，特此親筆簽署並蓋章，確認百分之百全數同意本區獨立分割案，並授權召集人辦理全般公務程序：</w:t>
+        <w:t>立連署同意書人已詳閱提案內容與附件可行性研究報告，特此簽署確認全體 6 戶 100% 達成專案獨立分割共識，並授權專案召集人代表本區出席管委會例會協商與推進大會審議：</w:t>
       </w:r>
     </w:p>
     <w:tbl>
@@ -1401,7 +1401,7 @@
                 <w:color w:val="B8860B"/>
                 <w:sz w:val="18"/>
               </w:rPr>
-              <w:t>【全體區權人共同委任授權條款】</w:t>
+              <w:t>【全體區權人共同推選與委任聲明】</w:t>
               <w:br/>
             </w:r>
             <w:r>
@@ -1410,7 +1410,7 @@
                 <w:color w:val="1A1D20"/>
                 <w:sz w:val="17"/>
               </w:rPr>
-              <w:t>本連署人等謹此共同推派並全權委託 廖倫豪 先生 代表本區 6 戶區權人，全權向富宇大地社區管理委員會提出本提案申請書、出席協商會議、確認資產清算明細，並向台中市龍井區公所辦理獨立管委會備查相關事宜。</w:t>
+              <w:t>本連署人等謹此共同推派 廖倫豪 代表本區 6 戶區權人，全權向富宇大地社區管理委員會提出本提案申請書、出席協商例行會議、確認清算資產明細與大會議案對接，並配合向主管機關辦理後續合規備查事宜。</w:t>
               <w:br/>
               <w:t>中華民國 115 年 _____ 月 _____ 日</w:t>
             </w:r>
@@ -1442,7 +1442,7 @@
           <w:color w:val="8C8273"/>
           <w:sz w:val="16"/>
         </w:rPr>
-        <w:t>附件一：《法定獨立分割可行性研究報告書》（全本乙份）</w:t>
+        <w:t>附件一：《法定獨立分割可行性研究報告書》（全本乙份，含財務審計分析與協議書草案）</w:t>
       </w:r>
     </w:p>
     <w:p>
@@ -1455,7 +1455,7 @@
           <w:color w:val="8C8273"/>
           <w:sz w:val="16"/>
         </w:rPr>
-        <w:t>附件二：富宇大地全區地籍圖及建築物使用執照影本（標註 A2 大境臨龍社路獨立出入）</w:t>
+        <w:t>附件二：富宇大地全區地籍圖及建築物配置出入圖（標註 A2 大境面臨龍社路公有計畫道路獨立出入）</w:t>
       </w:r>
     </w:p>
     <w:p>
@@ -1468,7 +1468,7 @@
           <w:color w:val="8C8273"/>
           <w:sz w:val="16"/>
         </w:rPr>
-        <w:t>附件三：富宇大地 115 年 5 月與 9 月例行會議記錄及新光銀行定存財報（載明 A2 定存單 $220,231 元）</w:t>
+        <w:t>附件三：富宇大地 115 年 5 月與 9 月例行會議記錄及新光銀行定存財報（載明 A2 定存專單 NT$ 220,231 元）</w:t>
       </w:r>
     </w:p>
     <w:p>
@@ -1488,7 +1488,7 @@
       <w:headerReference w:type="default" r:id="rId9"/>
       <w:footerReference w:type="default" r:id="rId10"/>
       <w:pgSz w:w="11906" w:h="16838"/>
-      <w:pgMar w:top="907" w:right="1020" w:bottom="907" w:left="1020" w:header="720" w:footer="720" w:gutter="0"/>
+      <w:pgMar w:top="794" w:right="1020" w:bottom="794" w:left="1020" w:header="720" w:footer="720" w:gutter="0"/>
       <w:cols w:space="720"/>
       <w:docGrid w:linePitch="360"/>
     </w:sectPr>
@@ -1536,7 +1536,7 @@
           <w:sz w:val="17"/>
           <w:color w:val="8C8273"/>
         </w:rPr>
-        <w:t>1</w:t>
+        <w:t>2</w:t>
       </w:r>
     </w:fldSimple>
     <w:r>
@@ -1564,7 +1564,7 @@
         <w:color w:val="8C8273"/>
         <w:sz w:val="16"/>
       </w:rPr>
-      <w:t>富宇大境（A2 區）法定獨立分割正式公文 ｜ 專案編號：FY-SPLIT-2026-A2</w:t>
+      <w:t>富宇大境（A2 區）獨立分割與管理優化提案書 ｜ 專案編號：FY-SPLIT-2026-A2</w:t>
     </w:r>
   </w:p>
 </w:hdr>

</xml_diff>